<commit_message>
Premier commit : Projet de facturation Django opérationnel
</commit_message>
<xml_diff>
--- a/templates/docx/Facture_Atelier_Mobile.docx
+++ b/templates/docx/Facture_Atelier_Mobile.docx
@@ -2,35 +2,106 @@
 <file path=word/document.xml><?xml version="1.0" encoding="utf-8"?>
 <w:document xmlns:wpc="http://schemas.microsoft.com/office/word/2010/wordprocessingCanvas" xmlns:mo="http://schemas.microsoft.com/office/mac/office/2008/main" xmlns:mc="http://schemas.openxmlformats.org/markup-compatibility/2006" xmlns:mv="urn:schemas-microsoft-com:mac:vml" xmlns:o="urn:schemas-microsoft-com:office:office" xmlns:r="http://schemas.openxmlformats.org/officeDocument/2006/relationships" xmlns:m="http://schemas.openxmlformats.org/officeDocument/2006/math" xmlns:v="urn:schemas-microsoft-com:vml" xmlns:wp14="http://schemas.microsoft.com/office/word/2010/wordprocessingDrawing" xmlns:wp="http://schemas.openxmlformats.org/drawingml/2006/wordprocessingDrawing" xmlns:w10="urn:schemas-microsoft-com:office:word" xmlns:w="http://schemas.openxmlformats.org/wordprocessingml/2006/main" xmlns:w14="http://schemas.microsoft.com/office/word/2010/wordml" xmlns:wpg="http://schemas.microsoft.com/office/word/2010/wordprocessingGroup" xmlns:wpi="http://schemas.microsoft.com/office/word/2010/wordprocessingInk" xmlns:wne="http://schemas.microsoft.com/office/word/2006/wordml" xmlns:wps="http://schemas.microsoft.com/office/word/2010/wordprocessingShape" mc:Ignorable="w14 wp14">
   <w:body>
+    <w:tbl>
+      <w:tblPr>
+        <w:tblW w:type="auto" w:w="0"/>
+        <w:jc w:val="center"/>
+        <w:tblLayout w:type="fixed"/>
+        <w:tblLook w:firstColumn="1" w:firstRow="1" w:lastColumn="0" w:lastRow="0" w:noHBand="0" w:noVBand="1" w:val="04A0"/>
+      </w:tblPr>
+      <w:tblGrid>
+        <w:gridCol w:w="4968"/>
+        <w:gridCol w:w="4968"/>
+      </w:tblGrid>
+      <w:tr>
+        <w:tc>
+          <w:tcPr>
+            <w:tcW w:type="dxa" w:w="5040"/>
+          </w:tcPr>
+          <w:p>
+            <w:pPr>
+              <w:spacing w:before="0" w:after="0"/>
+            </w:pPr>
+            <w:r>
+              <w:drawing>
+                <wp:inline xmlns:a="http://schemas.openxmlformats.org/drawingml/2006/main" xmlns:pic="http://schemas.openxmlformats.org/drawingml/2006/picture">
+                  <wp:extent cx="1645920" cy="793035"/>
+                  <wp:docPr id="1" name="Picture 1"/>
+                  <wp:cNvGraphicFramePr>
+                    <a:graphicFrameLocks noChangeAspect="1"/>
+                  </wp:cNvGraphicFramePr>
+                  <a:graphic>
+                    <a:graphicData uri="http://schemas.openxmlformats.org/drawingml/2006/picture">
+                      <pic:pic>
+                        <pic:nvPicPr>
+                          <pic:cNvPr id="0" name="logo_perso.png"/>
+                          <pic:cNvPicPr/>
+                        </pic:nvPicPr>
+                        <pic:blipFill>
+                          <a:blip r:embed="rId9"/>
+                          <a:stretch>
+                            <a:fillRect/>
+                          </a:stretch>
+                        </pic:blipFill>
+                        <pic:spPr>
+                          <a:xfrm>
+                            <a:off x="0" y="0"/>
+                            <a:ext cx="1645920" cy="793035"/>
+                          </a:xfrm>
+                          <a:prstGeom prst="rect"/>
+                        </pic:spPr>
+                      </pic:pic>
+                    </a:graphicData>
+                  </a:graphic>
+                </wp:inline>
+              </w:drawing>
+            </w:r>
+          </w:p>
+        </w:tc>
+        <w:tc>
+          <w:tcPr>
+            <w:tcW w:type="dxa" w:w="4320"/>
+          </w:tcPr>
+          <w:p>
+            <w:pPr>
+              <w:spacing w:before="0" w:after="0"/>
+              <w:jc w:val="right"/>
+            </w:pPr>
+            <w:r>
+              <w:rPr>
+                <w:b/>
+              </w:rPr>
+              <w:t>Date : {{ date_facture }}</w:t>
+              <w:br/>
+            </w:r>
+            <w:r>
+              <w:rPr>
+                <w:b/>
+              </w:rPr>
+              <w:t>N° {{ type_doc }} : {{ numero_facture }}</w:t>
+            </w:r>
+          </w:p>
+        </w:tc>
+      </w:tr>
+    </w:tbl>
     <w:p>
       <w:pPr>
-        <w:pStyle w:val="Heading1"/>
+        <w:spacing w:before="160" w:after="160"/>
+        <w:jc w:val="center"/>
       </w:pPr>
       <w:r>
-        <w:t>FACTURE DE SERVICE</w:t>
+        <w:rPr>
+          <w:b/>
+          <w:color w:val="1F4E79"/>
+          <w:sz w:val="40"/>
+        </w:rPr>
+        <w:t>{{ type_doc }} DE SERVICE</w:t>
       </w:r>
     </w:p>
     <w:p>
-      <w:r>
-        <w:rPr>
-          <w:b/>
-        </w:rPr>
-        <w:t xml:space="preserve">Date : </w:t>
-      </w:r>
-      <w:r>
-        <w:t>{{ date_facture }}</w:t>
-        <w:br/>
-      </w:r>
-      <w:r>
-        <w:rPr>
-          <w:b/>
-        </w:rPr>
-        <w:t xml:space="preserve">N° Facture : </w:t>
-      </w:r>
-      <w:r>
-        <w:t>{{ numero_facture }}</w:t>
-        <w:br/>
-      </w:r>
+      <w:pPr>
+        <w:spacing w:before="120" w:after="80"/>
+      </w:pPr>
       <w:r>
         <w:rPr>
           <w:b/>
@@ -73,8 +144,17 @@
       </w:r>
     </w:p>
     <w:p>
+      <w:pPr>
+        <w:spacing w:before="80" w:after="120"/>
+      </w:pPr>
       <w:r>
-        <w:t>Objet : {{ objet }}</w:t>
+        <w:rPr>
+          <w:b/>
+        </w:rPr>
+        <w:t xml:space="preserve">Objet : </w:t>
+      </w:r>
+      <w:r>
+        <w:t>{{ objet }}</w:t>
       </w:r>
     </w:p>
     <w:tbl>
@@ -84,15 +164,15 @@
         <w:tblLook w:firstColumn="1" w:firstRow="1" w:lastColumn="0" w:lastRow="0" w:noHBand="0" w:noVBand="1" w:val="04A0"/>
       </w:tblPr>
       <w:tblGrid>
-        <w:gridCol w:w="2160"/>
-        <w:gridCol w:w="2160"/>
-        <w:gridCol w:w="2160"/>
-        <w:gridCol w:w="2160"/>
+        <w:gridCol w:w="2484"/>
+        <w:gridCol w:w="2484"/>
+        <w:gridCol w:w="2484"/>
+        <w:gridCol w:w="2484"/>
       </w:tblGrid>
       <w:tr>
         <w:tc>
           <w:tcPr>
-            <w:tcW w:type="dxa" w:w="2160"/>
+            <w:tcW w:type="dxa" w:w="2484"/>
           </w:tcPr>
           <w:p>
             <w:r>
@@ -102,7 +182,7 @@
         </w:tc>
         <w:tc>
           <w:tcPr>
-            <w:tcW w:type="dxa" w:w="2160"/>
+            <w:tcW w:type="dxa" w:w="2484"/>
           </w:tcPr>
           <w:p>
             <w:r>
@@ -112,7 +192,7 @@
         </w:tc>
         <w:tc>
           <w:tcPr>
-            <w:tcW w:type="dxa" w:w="2160"/>
+            <w:tcW w:type="dxa" w:w="2484"/>
           </w:tcPr>
           <w:p>
             <w:r>
@@ -122,7 +202,7 @@
         </w:tc>
         <w:tc>
           <w:tcPr>
-            <w:tcW w:type="dxa" w:w="2160"/>
+            <w:tcW w:type="dxa" w:w="2484"/>
           </w:tcPr>
           <w:p>
             <w:r>
@@ -134,7 +214,7 @@
       <w:tr>
         <w:tc>
           <w:tcPr>
-            <w:tcW w:type="dxa" w:w="2160"/>
+            <w:tcW w:type="dxa" w:w="2484"/>
           </w:tcPr>
           <w:p>
             <w:r>
@@ -144,7 +224,7 @@
         </w:tc>
         <w:tc>
           <w:tcPr>
-            <w:tcW w:type="dxa" w:w="2160"/>
+            <w:tcW w:type="dxa" w:w="2484"/>
           </w:tcPr>
           <w:p>
             <w:r>
@@ -154,7 +234,7 @@
         </w:tc>
         <w:tc>
           <w:tcPr>
-            <w:tcW w:type="dxa" w:w="2160"/>
+            <w:tcW w:type="dxa" w:w="2484"/>
           </w:tcPr>
           <w:p>
             <w:r>
@@ -164,7 +244,7 @@
         </w:tc>
         <w:tc>
           <w:tcPr>
-            <w:tcW w:type="dxa" w:w="2160"/>
+            <w:tcW w:type="dxa" w:w="2484"/>
           </w:tcPr>
           <w:p>
             <w:r>
@@ -176,7 +256,7 @@
       <w:tr>
         <w:tc>
           <w:tcPr>
-            <w:tcW w:type="dxa" w:w="2160"/>
+            <w:tcW w:type="dxa" w:w="2484"/>
           </w:tcPr>
           <w:p>
             <w:r>
@@ -186,19 +266,19 @@
         </w:tc>
         <w:tc>
           <w:tcPr>
-            <w:tcW w:type="dxa" w:w="2160"/>
+            <w:tcW w:type="dxa" w:w="2484"/>
           </w:tcPr>
           <w:p/>
         </w:tc>
         <w:tc>
           <w:tcPr>
-            <w:tcW w:type="dxa" w:w="2160"/>
+            <w:tcW w:type="dxa" w:w="2484"/>
           </w:tcPr>
           <w:p/>
         </w:tc>
         <w:tc>
           <w:tcPr>
-            <w:tcW w:type="dxa" w:w="2160"/>
+            <w:tcW w:type="dxa" w:w="2484"/>
           </w:tcPr>
           <w:p>
             <w:r>
@@ -210,7 +290,7 @@
       <w:tr>
         <w:tc>
           <w:tcPr>
-            <w:tcW w:type="dxa" w:w="2160"/>
+            <w:tcW w:type="dxa" w:w="2484"/>
           </w:tcPr>
           <w:p>
             <w:r>
@@ -220,19 +300,19 @@
         </w:tc>
         <w:tc>
           <w:tcPr>
-            <w:tcW w:type="dxa" w:w="2160"/>
+            <w:tcW w:type="dxa" w:w="2484"/>
           </w:tcPr>
           <w:p/>
         </w:tc>
         <w:tc>
           <w:tcPr>
-            <w:tcW w:type="dxa" w:w="2160"/>
+            <w:tcW w:type="dxa" w:w="2484"/>
           </w:tcPr>
           <w:p/>
         </w:tc>
         <w:tc>
           <w:tcPr>
-            <w:tcW w:type="dxa" w:w="2160"/>
+            <w:tcW w:type="dxa" w:w="2484"/>
           </w:tcPr>
           <w:p>
             <w:r>
@@ -244,7 +324,7 @@
       <w:tr>
         <w:tc>
           <w:tcPr>
-            <w:tcW w:type="dxa" w:w="2160"/>
+            <w:tcW w:type="dxa" w:w="2484"/>
           </w:tcPr>
           <w:p>
             <w:r>
@@ -254,19 +334,19 @@
         </w:tc>
         <w:tc>
           <w:tcPr>
-            <w:tcW w:type="dxa" w:w="2160"/>
+            <w:tcW w:type="dxa" w:w="2484"/>
           </w:tcPr>
           <w:p/>
         </w:tc>
         <w:tc>
           <w:tcPr>
-            <w:tcW w:type="dxa" w:w="2160"/>
+            <w:tcW w:type="dxa" w:w="2484"/>
           </w:tcPr>
           <w:p/>
         </w:tc>
         <w:tc>
           <w:tcPr>
-            <w:tcW w:type="dxa" w:w="2160"/>
+            <w:tcW w:type="dxa" w:w="2484"/>
           </w:tcPr>
           <w:p>
             <w:r>
@@ -278,7 +358,7 @@
       <w:tr>
         <w:tc>
           <w:tcPr>
-            <w:tcW w:type="dxa" w:w="2160"/>
+            <w:tcW w:type="dxa" w:w="2484"/>
           </w:tcPr>
           <w:p>
             <w:r>
@@ -288,19 +368,19 @@
         </w:tc>
         <w:tc>
           <w:tcPr>
-            <w:tcW w:type="dxa" w:w="2160"/>
+            <w:tcW w:type="dxa" w:w="2484"/>
           </w:tcPr>
           <w:p/>
         </w:tc>
         <w:tc>
           <w:tcPr>
-            <w:tcW w:type="dxa" w:w="2160"/>
+            <w:tcW w:type="dxa" w:w="2484"/>
           </w:tcPr>
           <w:p/>
         </w:tc>
         <w:tc>
           <w:tcPr>
-            <w:tcW w:type="dxa" w:w="2160"/>
+            <w:tcW w:type="dxa" w:w="2484"/>
           </w:tcPr>
           <w:p>
             <w:r>
@@ -312,7 +392,7 @@
       <w:tr>
         <w:tc>
           <w:tcPr>
-            <w:tcW w:type="dxa" w:w="2160"/>
+            <w:tcW w:type="dxa" w:w="2484"/>
           </w:tcPr>
           <w:p>
             <w:r>
@@ -322,19 +402,19 @@
         </w:tc>
         <w:tc>
           <w:tcPr>
-            <w:tcW w:type="dxa" w:w="2160"/>
+            <w:tcW w:type="dxa" w:w="2484"/>
           </w:tcPr>
           <w:p/>
         </w:tc>
         <w:tc>
           <w:tcPr>
-            <w:tcW w:type="dxa" w:w="2160"/>
+            <w:tcW w:type="dxa" w:w="2484"/>
           </w:tcPr>
           <w:p/>
         </w:tc>
         <w:tc>
           <w:tcPr>
-            <w:tcW w:type="dxa" w:w="2160"/>
+            <w:tcW w:type="dxa" w:w="2484"/>
           </w:tcPr>
           <w:p>
             <w:r>
@@ -346,7 +426,7 @@
       <w:tr>
         <w:tc>
           <w:tcPr>
-            <w:tcW w:type="dxa" w:w="2160"/>
+            <w:tcW w:type="dxa" w:w="2484"/>
           </w:tcPr>
           <w:p>
             <w:r>
@@ -356,19 +436,19 @@
         </w:tc>
         <w:tc>
           <w:tcPr>
-            <w:tcW w:type="dxa" w:w="2160"/>
+            <w:tcW w:type="dxa" w:w="2484"/>
           </w:tcPr>
           <w:p/>
         </w:tc>
         <w:tc>
           <w:tcPr>
-            <w:tcW w:type="dxa" w:w="2160"/>
+            <w:tcW w:type="dxa" w:w="2484"/>
           </w:tcPr>
           <w:p/>
         </w:tc>
         <w:tc>
           <w:tcPr>
-            <w:tcW w:type="dxa" w:w="2160"/>
+            <w:tcW w:type="dxa" w:w="2484"/>
           </w:tcPr>
           <w:p>
             <w:r>
@@ -384,9 +464,25 @@
         <w:t>Arrêté la présente facture à la somme de : {{ net_en_lettres }}</w:t>
       </w:r>
     </w:p>
+    <w:p>
+      <w:pPr>
+        <w:spacing w:before="360"/>
+        <w:jc w:val="right"/>
+      </w:pPr>
+      <w:r>
+        <w:rPr>
+          <w:b/>
+          <w:sz w:val="24"/>
+        </w:rPr>
+        <w:t>Le Responsable</w:t>
+        <w:br/>
+        <w:br/>
+        <w:br/>
+      </w:r>
+    </w:p>
     <w:sectPr>
       <w:pgSz w:w="12240" w:h="15840"/>
-      <w:pgMar w:top="1440" w:right="1800" w:bottom="1440" w:left="1800" w:header="720" w:footer="720" w:gutter="0"/>
+      <w:pgMar w:top="864" w:right="1152" w:bottom="1152" w:left="1152" w:header="720" w:footer="720" w:gutter="0"/>
       <w:cols w:space="720"/>
       <w:docGrid w:linePitch="360"/>
     </w:sectPr>

</xml_diff>